<commit_message>
📝 Update Supervisor Meeting
Prepared the meeting minutes for the discussion tomorrow
</commit_message>
<xml_diff>
--- a/docs/Supervisor Meetings/Meeting 26.03.docx
+++ b/docs/Supervisor Meetings/Meeting 26.03.docx
@@ -87,7 +87,13 @@
         <w:t>Attendees:</w:t>
       </w:r>
       <w:r>
-        <w:t xml:space="preserve"> Student, </w:t>
+        <w:t xml:space="preserve"> </w:t>
+      </w:r>
+      <w:r>
+        <w:t>s</w:t>
+      </w:r>
+      <w:r>
+        <w:t xml:space="preserve">tudent, </w:t>
       </w:r>
       <w:r>
         <w:t>s</w:t>
@@ -132,7 +138,10 @@
         <w:t>Progress Update:</w:t>
       </w:r>
       <w:r>
-        <w:t xml:space="preserve"> [Brief summary]</w:t>
+        <w:t xml:space="preserve"> </w:t>
+      </w:r>
+      <w:r>
+        <w:t>uploaded the Ethical Form on Moodle, scraped year using Spotify’s API</w:t>
       </w:r>
     </w:p>
     <w:p>
@@ -149,7 +158,10 @@
         <w:t>Challenges Faced:</w:t>
       </w:r>
       <w:r>
-        <w:t xml:space="preserve"> [List key issues]</w:t>
+        <w:t xml:space="preserve"> </w:t>
+      </w:r>
+      <w:r>
+        <w:t>API constraints in terms of time (request limits), questions about the sample and its size</w:t>
       </w:r>
     </w:p>
     <w:p>
@@ -184,7 +196,13 @@
         <w:t>Next Steps:</w:t>
       </w:r>
       <w:r>
-        <w:t xml:space="preserve"> [Action items &amp; deadlines]</w:t>
+        <w:t xml:space="preserve"> </w:t>
+      </w:r>
+      <w:r>
+        <w:t>Scrape some more data</w:t>
+      </w:r>
+      <w:r>
+        <w:t xml:space="preserve"> according to the chosen sample size, clean the data, perform EDA</w:t>
       </w:r>
     </w:p>
     <w:p>

</xml_diff>

<commit_message>
📝 Update Meeting 26.03
The minutes for today's meeting have been updated with notes
</commit_message>
<xml_diff>
--- a/docs/Supervisor Meetings/Meeting 26.03.docx
+++ b/docs/Supervisor Meetings/Meeting 26.03.docx
@@ -161,7 +161,16 @@
         <w:t xml:space="preserve"> </w:t>
       </w:r>
       <w:r>
-        <w:t>API constraints in terms of time (request limits), questions about the sample and its size</w:t>
+        <w:t>API constraints in terms of time (request limits), sample</w:t>
+      </w:r>
+      <w:r>
+        <w:t xml:space="preserve"> of the population</w:t>
+      </w:r>
+      <w:r>
+        <w:t xml:space="preserve"> and its size</w:t>
+      </w:r>
+      <w:r>
+        <w:t>, forgetting Samuel’s github names</w:t>
       </w:r>
     </w:p>
     <w:p>

</xml_diff>

<commit_message>
📝 Update Meeting Minutes
Added supervisor's signature to the previous meeting and updated the next meeting with a new date & time, since it got rescheduled
</commit_message>
<xml_diff>
--- a/docs/Supervisor Meetings/Meeting 26.03.docx
+++ b/docs/Supervisor Meetings/Meeting 26.03.docx
@@ -7,7 +7,7 @@
         <w:pStyle w:val="Title"/>
         <w:spacing w:before="240" w:after="240"/>
         <w:rPr>
-          <w:lang w:val="pl-PL"/>
+          <w:lang w:val="en-IE"/>
         </w:rPr>
       </w:pPr>
       <w:bookmarkStart w:id="0" w:name="_el4ssc9d8p41" w:colFirst="0" w:colLast="0"/>
@@ -321,18 +321,22 @@
       <w:pPr>
         <w:spacing w:before="240" w:after="240"/>
         <w:rPr>
+          <w:lang w:val="en-US"/>
+        </w:rPr>
+      </w:pPr>
+      <w:r>
+        <w:rPr>
           <w:b/>
           <w:bCs/>
           <w:lang w:val="en-US"/>
         </w:rPr>
-      </w:pPr>
-      <w:r>
-        <w:rPr>
-          <w:b/>
-          <w:bCs/>
+        <w:t xml:space="preserve">Signature of Supervisor </w:t>
+      </w:r>
+      <w:r>
+        <w:rPr>
           <w:lang w:val="en-US"/>
         </w:rPr>
-        <w:t xml:space="preserve">Signature of Supervisor </w:t>
+        <w:t>Samuel Moore</w:t>
       </w:r>
     </w:p>
     <w:p/>

</xml_diff>